<commit_message>
small change in notes
</commit_message>
<xml_diff>
--- a/docs/meeting notes/Meeting_Notes_20250121.docx
+++ b/docs/meeting notes/Meeting_Notes_20250121.docx
@@ -44,7 +44,7 @@
       <w:pPr>
         <w:numPr>
           <w:ilvl w:val="0"/>
-          <w:numId w:val="2"/>
+          <w:numId w:val="3"/>
         </w:numPr>
         <w:ind w:left="720" w:hanging="360"/>
         <w:rPr>
@@ -56,6 +56,284 @@
           <w:rtl w:val="0"/>
         </w:rPr>
         <w:t xml:space="preserve">Documentation</w:t>
+      </w:r>
+    </w:p>
+    <w:p>
+      <w:pPr>
+        <w:numPr>
+          <w:ilvl w:val="0"/>
+          <w:numId w:val="3"/>
+        </w:numPr>
+        <w:ind w:left="720" w:hanging="360"/>
+        <w:rPr>
+          <w:u w:val="none"/>
+        </w:rPr>
+      </w:pPr>
+      <w:r>
+        <w:rPr>
+          <w:rtl w:val="0"/>
+        </w:rPr>
+        <w:t xml:space="preserve">Wikipedia articles - we still have to update the requirements of the project plan and add it in the changelog, also add it in the data and sources part of the project plan</w:t>
+      </w:r>
+    </w:p>
+    <w:p>
+      <w:pPr>
+        <w:numPr>
+          <w:ilvl w:val="0"/>
+          <w:numId w:val="3"/>
+        </w:numPr>
+        <w:ind w:left="720" w:hanging="360"/>
+        <w:rPr>
+          <w:u w:val="none"/>
+        </w:rPr>
+      </w:pPr>
+      <w:r>
+        <w:rPr>
+          <w:rtl w:val="0"/>
+        </w:rPr>
+        <w:t xml:space="preserve">Custom photos</w:t>
+      </w:r>
+    </w:p>
+    <w:p>
+      <w:pPr>
+        <w:numPr>
+          <w:ilvl w:val="0"/>
+          <w:numId w:val="3"/>
+        </w:numPr>
+        <w:ind w:left="720" w:hanging="360"/>
+        <w:rPr>
+          <w:u w:val="none"/>
+        </w:rPr>
+      </w:pPr>
+      <w:r>
+        <w:rPr>
+          <w:rtl w:val="0"/>
+        </w:rPr>
+        <w:t xml:space="preserve">Instruction window</w:t>
+      </w:r>
+    </w:p>
+    <w:p>
+      <w:pPr>
+        <w:numPr>
+          <w:ilvl w:val="0"/>
+          <w:numId w:val="3"/>
+        </w:numPr>
+        <w:ind w:left="720" w:hanging="360"/>
+        <w:rPr>
+          <w:u w:val="none"/>
+        </w:rPr>
+      </w:pPr>
+      <w:r>
+        <w:rPr>
+          <w:rtl w:val="0"/>
+        </w:rPr>
+        <w:t xml:space="preserve">Extra tests</w:t>
+      </w:r>
+    </w:p>
+    <w:p>
+      <w:pPr>
+        <w:rPr/>
+      </w:pPr>
+      <w:r>
+        <w:rPr>
+          <w:rtl w:val="0"/>
+        </w:rPr>
+      </w:r>
+    </w:p>
+    <w:p>
+      <w:pPr>
+        <w:rPr/>
+      </w:pPr>
+      <w:r>
+        <w:rPr>
+          <w:rtl w:val="0"/>
+        </w:rPr>
+      </w:r>
+    </w:p>
+    <w:p>
+      <w:pPr>
+        <w:rPr/>
+      </w:pPr>
+      <w:r>
+        <w:rPr>
+          <w:rtl w:val="0"/>
+        </w:rPr>
+        <w:t xml:space="preserve">What we plan on doing this week:</w:t>
+      </w:r>
+    </w:p>
+    <w:p>
+      <w:pPr>
+        <w:numPr>
+          <w:ilvl w:val="0"/>
+          <w:numId w:val="4"/>
+        </w:numPr>
+        <w:ind w:left="720" w:hanging="360"/>
+        <w:rPr>
+          <w:u w:val="none"/>
+        </w:rPr>
+      </w:pPr>
+      <w:r>
+        <w:rPr>
+          <w:rtl w:val="0"/>
+        </w:rPr>
+        <w:t xml:space="preserve">Merging everything into main</w:t>
+      </w:r>
+    </w:p>
+    <w:p>
+      <w:pPr>
+        <w:numPr>
+          <w:ilvl w:val="0"/>
+          <w:numId w:val="4"/>
+        </w:numPr>
+        <w:ind w:left="720" w:hanging="360"/>
+        <w:rPr>
+          <w:u w:val="none"/>
+        </w:rPr>
+      </w:pPr>
+      <w:r>
+        <w:rPr>
+          <w:rtl w:val="0"/>
+        </w:rPr>
+        <w:t xml:space="preserve">Cleaning up and last bug fixes</w:t>
+      </w:r>
+    </w:p>
+    <w:p>
+      <w:pPr>
+        <w:numPr>
+          <w:ilvl w:val="0"/>
+          <w:numId w:val="4"/>
+        </w:numPr>
+        <w:ind w:left="720" w:hanging="360"/>
+        <w:rPr>
+          <w:u w:val="none"/>
+        </w:rPr>
+      </w:pPr>
+      <w:r>
+        <w:rPr>
+          <w:rtl w:val="0"/>
+        </w:rPr>
+        <w:t xml:space="preserve">Preparing presentation</w:t>
+      </w:r>
+    </w:p>
+    <w:p>
+      <w:pPr>
+        <w:rPr/>
+      </w:pPr>
+      <w:r>
+        <w:rPr>
+          <w:rtl w:val="0"/>
+        </w:rPr>
+      </w:r>
+    </w:p>
+    <w:p>
+      <w:pPr>
+        <w:rPr/>
+      </w:pPr>
+      <w:r>
+        <w:rPr>
+          <w:rtl w:val="0"/>
+        </w:rPr>
+      </w:r>
+    </w:p>
+    <w:p>
+      <w:pPr>
+        <w:rPr/>
+      </w:pPr>
+      <w:r>
+        <w:rPr>
+          <w:rtl w:val="0"/>
+        </w:rPr>
+        <w:t xml:space="preserve">Questions for TA:</w:t>
+      </w:r>
+    </w:p>
+    <w:p>
+      <w:pPr>
+        <w:numPr>
+          <w:ilvl w:val="0"/>
+          <w:numId w:val="6"/>
+        </w:numPr>
+        <w:ind w:left="720" w:hanging="360"/>
+        <w:rPr>
+          <w:u w:val="none"/>
+        </w:rPr>
+      </w:pPr>
+      <w:r>
+        <w:rPr>
+          <w:rtl w:val="0"/>
+        </w:rPr>
+        <w:t xml:space="preserve">Do we have to repeat the demonstration of the midterm meeting?</w:t>
+      </w:r>
+    </w:p>
+    <w:p>
+      <w:pPr>
+        <w:ind w:left="720" w:firstLine="0"/>
+        <w:rPr/>
+      </w:pPr>
+      <w:r>
+        <w:rPr>
+          <w:rtl w:val="0"/>
+        </w:rPr>
+        <w:t xml:space="preserve">Yes, in its entirety but focus on the most important things.</w:t>
+      </w:r>
+    </w:p>
+    <w:p>
+      <w:pPr>
+        <w:numPr>
+          <w:ilvl w:val="0"/>
+          <w:numId w:val="1"/>
+        </w:numPr>
+        <w:ind w:left="720" w:hanging="360"/>
+        <w:rPr>
+          <w:u w:val="none"/>
+        </w:rPr>
+      </w:pPr>
+      <w:r>
+        <w:rPr>
+          <w:rtl w:val="0"/>
+        </w:rPr>
+        <w:t xml:space="preserve">What are the key differences with the midterm presentation? </w:t>
+      </w:r>
+    </w:p>
+    <w:p>
+      <w:pPr>
+        <w:ind w:left="720" w:firstLine="0"/>
+        <w:rPr/>
+      </w:pPr>
+      <w:r>
+        <w:rPr>
+          <w:rtl w:val="0"/>
+        </w:rPr>
+        <w:t xml:space="preserve">You only have 10 minutes. Look at the rubric and structure your time according to the weights of the grades. </w:t>
+      </w:r>
+    </w:p>
+    <w:p>
+      <w:pPr>
+        <w:numPr>
+          <w:ilvl w:val="0"/>
+          <w:numId w:val="6"/>
+        </w:numPr>
+        <w:ind w:left="720" w:hanging="360"/>
+        <w:rPr>
+          <w:u w:val="none"/>
+        </w:rPr>
+      </w:pPr>
+      <w:r>
+        <w:rPr>
+          <w:rtl w:val="0"/>
+        </w:rPr>
+        <w:t xml:space="preserve">Do we have to show all should and could have features in the demo?</w:t>
+      </w:r>
+    </w:p>
+    <w:p>
+      <w:pPr>
+        <w:ind w:left="720" w:firstLine="0"/>
+        <w:rPr/>
+      </w:pPr>
+      <w:r>
+        <w:rPr>
+          <w:rtl w:val="0"/>
+        </w:rPr>
+        <w:t xml:space="preserve">Don’t focus on pressing every single button. Ivar does not look at the code so make sure he knows what is going on. Some groups forget that not everyone is familiar with the application.</w:t>
       </w:r>
     </w:p>
     <w:p>
@@ -73,71 +351,19 @@
         <w:rPr>
           <w:rtl w:val="0"/>
         </w:rPr>
-        <w:t xml:space="preserve">Wikipedia articles - we still have to update the requirements of the project plan and add it in the changelog, also add it in the data and sources part of the project plan</w:t>
-      </w:r>
-    </w:p>
-    <w:p>
-      <w:pPr>
-        <w:numPr>
-          <w:ilvl w:val="0"/>
-          <w:numId w:val="2"/>
-        </w:numPr>
-        <w:ind w:left="720" w:hanging="360"/>
-        <w:rPr>
-          <w:u w:val="none"/>
-        </w:rPr>
-      </w:pPr>
-      <w:r>
-        <w:rPr>
-          <w:rtl w:val="0"/>
-        </w:rPr>
-        <w:t xml:space="preserve">Custom photos</w:t>
-      </w:r>
-    </w:p>
-    <w:p>
-      <w:pPr>
-        <w:numPr>
-          <w:ilvl w:val="0"/>
-          <w:numId w:val="2"/>
-        </w:numPr>
-        <w:ind w:left="720" w:hanging="360"/>
-        <w:rPr>
-          <w:u w:val="none"/>
-        </w:rPr>
-      </w:pPr>
-      <w:r>
-        <w:rPr>
-          <w:rtl w:val="0"/>
-        </w:rPr>
-        <w:t xml:space="preserve">Instruction window</w:t>
-      </w:r>
-    </w:p>
-    <w:p>
-      <w:pPr>
-        <w:numPr>
-          <w:ilvl w:val="0"/>
-          <w:numId w:val="2"/>
-        </w:numPr>
-        <w:ind w:left="720" w:hanging="360"/>
-        <w:rPr>
-          <w:u w:val="none"/>
-        </w:rPr>
-      </w:pPr>
-      <w:r>
-        <w:rPr>
-          <w:rtl w:val="0"/>
-        </w:rPr>
-        <w:t xml:space="preserve">Extra tests</w:t>
-      </w:r>
-    </w:p>
-    <w:p>
-      <w:pPr>
+        <w:t xml:space="preserve">Do we have to mention every single requirement?</w:t>
+      </w:r>
+    </w:p>
+    <w:p>
+      <w:pPr>
+        <w:ind w:left="720" w:firstLine="0"/>
         <w:rPr/>
       </w:pPr>
       <w:r>
         <w:rPr>
           <w:rtl w:val="0"/>
         </w:rPr>
+        <w:t xml:space="preserve">No, it will be boring and take time. Try to group them or mention them during the demo. Maybe make a quiz or something interactive to maximize engagement.</w:t>
       </w:r>
     </w:p>
     <w:p>
@@ -158,61 +384,6 @@
         <w:rPr>
           <w:rtl w:val="0"/>
         </w:rPr>
-        <w:t xml:space="preserve">What we plan on doing this week:</w:t>
-      </w:r>
-    </w:p>
-    <w:p>
-      <w:pPr>
-        <w:numPr>
-          <w:ilvl w:val="0"/>
-          <w:numId w:val="3"/>
-        </w:numPr>
-        <w:ind w:left="720" w:hanging="360"/>
-        <w:rPr>
-          <w:u w:val="none"/>
-        </w:rPr>
-      </w:pPr>
-      <w:r>
-        <w:rPr>
-          <w:rtl w:val="0"/>
-        </w:rPr>
-        <w:t xml:space="preserve">Merging everything into main</w:t>
-      </w:r>
-    </w:p>
-    <w:p>
-      <w:pPr>
-        <w:numPr>
-          <w:ilvl w:val="0"/>
-          <w:numId w:val="3"/>
-        </w:numPr>
-        <w:ind w:left="720" w:hanging="360"/>
-        <w:rPr>
-          <w:u w:val="none"/>
-        </w:rPr>
-      </w:pPr>
-      <w:r>
-        <w:rPr>
-          <w:rtl w:val="0"/>
-        </w:rPr>
-        <w:t xml:space="preserve">Cleaning up and last bug fixes</w:t>
-      </w:r>
-    </w:p>
-    <w:p>
-      <w:pPr>
-        <w:numPr>
-          <w:ilvl w:val="0"/>
-          <w:numId w:val="3"/>
-        </w:numPr>
-        <w:ind w:left="720" w:hanging="360"/>
-        <w:rPr>
-          <w:u w:val="none"/>
-        </w:rPr>
-      </w:pPr>
-      <w:r>
-        <w:rPr>
-          <w:rtl w:val="0"/>
-        </w:rPr>
-        <w:t xml:space="preserve">Preparing presentation</w:t>
       </w:r>
     </w:p>
     <w:p>
@@ -223,27 +394,7 @@
         <w:rPr>
           <w:rtl w:val="0"/>
         </w:rPr>
-      </w:r>
-    </w:p>
-    <w:p>
-      <w:pPr>
-        <w:rPr/>
-      </w:pPr>
-      <w:r>
-        <w:rPr>
-          <w:rtl w:val="0"/>
-        </w:rPr>
-      </w:r>
-    </w:p>
-    <w:p>
-      <w:pPr>
-        <w:rPr/>
-      </w:pPr>
-      <w:r>
-        <w:rPr>
-          <w:rtl w:val="0"/>
-        </w:rPr>
-        <w:t xml:space="preserve">Questions for TA:</w:t>
+        <w:t xml:space="preserve">Questions for us:</w:t>
       </w:r>
     </w:p>
     <w:p>
@@ -261,19 +412,7 @@
         <w:rPr>
           <w:rtl w:val="0"/>
         </w:rPr>
-        <w:t xml:space="preserve">Do we have to repeat the demonstration of the midterm meeting? </w:t>
-      </w:r>
-    </w:p>
-    <w:p>
-      <w:pPr>
-        <w:ind w:left="720" w:firstLine="0"/>
-        <w:rPr/>
-      </w:pPr>
-      <w:r>
-        <w:rPr>
-          <w:rtl w:val="0"/>
-        </w:rPr>
-        <w:t xml:space="preserve">What are the key differences with the midterm presentation? Yes, in its entirety but focus on the most important things. You only have 10 minutes. Look at the rubric and structure your time according to the weights of the grades. </w:t>
+        <w:t xml:space="preserve">Nice job</w:t>
       </w:r>
     </w:p>
     <w:p>
@@ -291,7 +430,7 @@
         <w:rPr>
           <w:rtl w:val="0"/>
         </w:rPr>
-        <w:t xml:space="preserve">Do we have to show all should and could have features in the demo?</w:t>
+        <w:t xml:space="preserve">Should haves that are not assigned won’t be done anymore?</w:t>
       </w:r>
     </w:p>
     <w:p>
@@ -303,116 +442,7 @@
         <w:rPr>
           <w:rtl w:val="0"/>
         </w:rPr>
-        <w:t xml:space="preserve">Don’t focus on pressing every single button. Ivar does not look at the code so make sure he knows what is going on. Some groups forget that not everyone is familiar with the application.</w:t>
-      </w:r>
-    </w:p>
-    <w:p>
-      <w:pPr>
-        <w:numPr>
-          <w:ilvl w:val="0"/>
-          <w:numId w:val="1"/>
-        </w:numPr>
-        <w:ind w:left="720" w:hanging="360"/>
-        <w:rPr>
-          <w:u w:val="none"/>
-        </w:rPr>
-      </w:pPr>
-      <w:r>
-        <w:rPr>
-          <w:rtl w:val="0"/>
-        </w:rPr>
-        <w:t xml:space="preserve">Do we have to mention every single requirement?</w:t>
-      </w:r>
-    </w:p>
-    <w:p>
-      <w:pPr>
-        <w:ind w:left="720" w:firstLine="0"/>
-        <w:rPr/>
-      </w:pPr>
-      <w:r>
-        <w:rPr>
-          <w:rtl w:val="0"/>
-        </w:rPr>
-        <w:t xml:space="preserve">No, it will be boring and take time. Try to group them or mention them during the demo. Maybe make a quiz or something interactive to maximize engagement.</w:t>
-      </w:r>
-    </w:p>
-    <w:p>
-      <w:pPr>
-        <w:rPr/>
-      </w:pPr>
-      <w:r>
-        <w:rPr>
-          <w:rtl w:val="0"/>
-        </w:rPr>
-      </w:r>
-    </w:p>
-    <w:p>
-      <w:pPr>
-        <w:rPr/>
-      </w:pPr>
-      <w:r>
-        <w:rPr>
-          <w:rtl w:val="0"/>
-        </w:rPr>
-      </w:r>
-    </w:p>
-    <w:p>
-      <w:pPr>
-        <w:rPr/>
-      </w:pPr>
-      <w:r>
-        <w:rPr>
-          <w:rtl w:val="0"/>
-        </w:rPr>
-        <w:t xml:space="preserve">Questions for us:</w:t>
-      </w:r>
-    </w:p>
-    <w:p>
-      <w:pPr>
-        <w:numPr>
-          <w:ilvl w:val="0"/>
-          <w:numId w:val="4"/>
-        </w:numPr>
-        <w:ind w:left="720" w:hanging="360"/>
-        <w:rPr>
-          <w:u w:val="none"/>
-        </w:rPr>
-      </w:pPr>
-      <w:r>
-        <w:rPr>
-          <w:rtl w:val="0"/>
-        </w:rPr>
-        <w:t xml:space="preserve">Nice job</w:t>
-      </w:r>
-    </w:p>
-    <w:p>
-      <w:pPr>
-        <w:numPr>
-          <w:ilvl w:val="0"/>
-          <w:numId w:val="4"/>
-        </w:numPr>
-        <w:ind w:left="720" w:hanging="360"/>
-        <w:rPr>
-          <w:u w:val="none"/>
-        </w:rPr>
-      </w:pPr>
-      <w:r>
-        <w:rPr>
-          <w:rtl w:val="0"/>
-        </w:rPr>
-        <w:t xml:space="preserve">Should haves that are not assigned won’t be done anymore?</w:t>
-      </w:r>
-    </w:p>
-    <w:p>
-      <w:pPr>
-        <w:ind w:left="720" w:firstLine="0"/>
-        <w:rPr/>
-      </w:pPr>
-      <w:r>
-        <w:rPr>
-          <w:rtl w:val="0"/>
-        </w:rPr>
-        <w:t xml:space="preserve">Yes, they were way too much work to still finish them.</w:t>
+        <w:t xml:space="preserve">No, they were way too much work to still finish them.</w:t>
       </w:r>
       <w:r>
         <w:rPr>
@@ -872,6 +902,116 @@
     </w:lvl>
   </w:abstractNum>
   <w:abstractNum w:abstractNumId="5">
+    <w:lvl w:ilvl="0">
+      <w:start w:val="1"/>
+      <w:numFmt w:val="bullet"/>
+      <w:lvlText w:val="-"/>
+      <w:lvlJc w:val="left"/>
+      <w:pPr>
+        <w:ind w:left="720" w:hanging="360"/>
+      </w:pPr>
+      <w:rPr>
+        <w:u w:val="none"/>
+      </w:rPr>
+    </w:lvl>
+    <w:lvl w:ilvl="1">
+      <w:start w:val="1"/>
+      <w:numFmt w:val="bullet"/>
+      <w:lvlText w:val="-"/>
+      <w:lvlJc w:val="left"/>
+      <w:pPr>
+        <w:ind w:left="1440" w:hanging="360"/>
+      </w:pPr>
+      <w:rPr>
+        <w:u w:val="none"/>
+      </w:rPr>
+    </w:lvl>
+    <w:lvl w:ilvl="2">
+      <w:start w:val="1"/>
+      <w:numFmt w:val="bullet"/>
+      <w:lvlText w:val="-"/>
+      <w:lvlJc w:val="left"/>
+      <w:pPr>
+        <w:ind w:left="2160" w:hanging="360"/>
+      </w:pPr>
+      <w:rPr>
+        <w:u w:val="none"/>
+      </w:rPr>
+    </w:lvl>
+    <w:lvl w:ilvl="3">
+      <w:start w:val="1"/>
+      <w:numFmt w:val="bullet"/>
+      <w:lvlText w:val="-"/>
+      <w:lvlJc w:val="left"/>
+      <w:pPr>
+        <w:ind w:left="2880" w:hanging="360"/>
+      </w:pPr>
+      <w:rPr>
+        <w:u w:val="none"/>
+      </w:rPr>
+    </w:lvl>
+    <w:lvl w:ilvl="4">
+      <w:start w:val="1"/>
+      <w:numFmt w:val="bullet"/>
+      <w:lvlText w:val="-"/>
+      <w:lvlJc w:val="left"/>
+      <w:pPr>
+        <w:ind w:left="3600" w:hanging="360"/>
+      </w:pPr>
+      <w:rPr>
+        <w:u w:val="none"/>
+      </w:rPr>
+    </w:lvl>
+    <w:lvl w:ilvl="5">
+      <w:start w:val="1"/>
+      <w:numFmt w:val="bullet"/>
+      <w:lvlText w:val="-"/>
+      <w:lvlJc w:val="left"/>
+      <w:pPr>
+        <w:ind w:left="4320" w:hanging="360"/>
+      </w:pPr>
+      <w:rPr>
+        <w:u w:val="none"/>
+      </w:rPr>
+    </w:lvl>
+    <w:lvl w:ilvl="6">
+      <w:start w:val="1"/>
+      <w:numFmt w:val="bullet"/>
+      <w:lvlText w:val="-"/>
+      <w:lvlJc w:val="left"/>
+      <w:pPr>
+        <w:ind w:left="5040" w:hanging="360"/>
+      </w:pPr>
+      <w:rPr>
+        <w:u w:val="none"/>
+      </w:rPr>
+    </w:lvl>
+    <w:lvl w:ilvl="7">
+      <w:start w:val="1"/>
+      <w:numFmt w:val="bullet"/>
+      <w:lvlText w:val="-"/>
+      <w:lvlJc w:val="left"/>
+      <w:pPr>
+        <w:ind w:left="5760" w:hanging="360"/>
+      </w:pPr>
+      <w:rPr>
+        <w:u w:val="none"/>
+      </w:rPr>
+    </w:lvl>
+    <w:lvl w:ilvl="8">
+      <w:start w:val="1"/>
+      <w:numFmt w:val="bullet"/>
+      <w:lvlText w:val="-"/>
+      <w:lvlJc w:val="left"/>
+      <w:pPr>
+        <w:ind w:left="6480" w:hanging="360"/>
+      </w:pPr>
+      <w:rPr>
+        <w:u w:val="none"/>
+      </w:rPr>
+    </w:lvl>
+  </w:abstractNum>
+  <w:abstractNum w:abstractNumId="6">
     <w:lvl w:ilvl="0">
       <w:start w:val="1"/>
       <w:numFmt w:val="bullet"/>
@@ -995,6 +1135,9 @@
   </w:num>
   <w:num w:numId="5">
     <w:abstractNumId w:val="5"/>
+  </w:num>
+  <w:num w:numId="6">
+    <w:abstractNumId w:val="6"/>
   </w:num>
 </w:numbering>
 </file>

</xml_diff>